<commit_message>
[adb-launch-app-api] Bước 4.4: DevOps Lead approve staging — chờ user go-live production
- APPROVE STAGING (container-level smoke test PASS)
- KHÔNG tự approve production — cần user smoke test thiết bị Android thật trên hạ tầng thật trước
- Plan hoàn thành toàn bộ agent chain (10/10 bước)

Plan: docs/plans/PLAN-adb-launch-app-api-2026-08-18/steps/STEP-4.4-devops-lead-approve.md

Co-Authored-By: Claude Sonnet 5 <noreply@anthropic.com>
</commit_message>
<xml_diff>
--- a/docs/devops/DEPLOY-adb-launch-app-api.docx
+++ b/docs/devops/DEPLOY-adb-launch-app-api.docx
@@ -51,6 +51,17 @@
         <w:rPr>
           <w:sz w:val="21"/>
         </w:rPr>
+        <w:t>reviewed-by: DevOps Lead</w:t>
+      </w:r>
+    </w:p>
+    <w:p>
+      <w:pPr>
+        <w:spacing w:after="80"/>
+      </w:pPr>
+      <w:r>
+        <w:rPr>
+          <w:sz w:val="21"/>
+        </w:rPr>
         <w:t>created: 2026-08-18</w:t>
       </w:r>
     </w:p>
@@ -62,7 +73,18 @@
         <w:rPr>
           <w:sz w:val="21"/>
         </w:rPr>
-        <w:t>status: container-verified</w:t>
+        <w:t>updated: 2026-08-18</w:t>
+      </w:r>
+    </w:p>
+    <w:p>
+      <w:pPr>
+        <w:spacing w:after="80"/>
+      </w:pPr>
+      <w:r>
+        <w:rPr>
+          <w:sz w:val="21"/>
+        </w:rPr>
+        <w:t>status: staging-approved-pending-production</w:t>
       </w:r>
     </w:p>
     <w:p>
@@ -526,7 +548,7 @@
         <w:rPr>
           <w:color w:val="4A3F8C"/>
         </w:rPr>
-        <w:t>Checklist này phải được DevOps Lead điền và sign-off tại STEP-4.4 trước khi thực sự go-live.</w:t>
+        <w:t>Checklist này được DevOps Lead điền và sign-off tại STEP-4.4.</w:t>
       </w:r>
     </w:p>
     <w:p>
@@ -541,25 +563,27 @@
           <w:color w:val="251C53"/>
           <w:sz w:val="18"/>
         </w:rPr>
-        <w:t>[ ] PR approved bởi Tech Lead                              ✅ (STEP-3.2 done)</w:t>
+        <w:t>[x] PR approved bởi Tech Lead                              ✅ (STEP-3.2 done)</w:t>
         <w:br/>
         <w:t>[ ] CI/CD pass toàn bộ                                    — (chưa có CI pipeline; unit test 42/42 PASS local)</w:t>
         <w:br/>
-        <w:t>[ ] QA sign-off trên staging                               ✅ CÓ ĐIỀU KIỆN (xem mục 5)</w:t>
+        <w:t>[x] QA sign-off trên staging                               ✅ CÓ ĐIỀU KIỆN (xem mục 5 + mục 8)</w:t>
         <w:br/>
-        <w:t>[ ] DevOps Lead approve                                    ⬜ (STEP-4.4 pending)</w:t>
+        <w:t>[x] DevOps Lead approve STAGING                            ✅ (STEP-4.4 — 2026-08-18 17:20, xem mục 7)</w:t>
         <w:br/>
-        <w:t>[ ] EM approve (feature lớn)                               ⏭️ Skipped — P1 feature không yêu cầu EM approve riêng</w:t>
+        <w:t>[ ] DevOps Lead approve PRODUCTION                         ⬜ CHỜ USER — xem mục 8 bên dưới</w:t>
         <w:br/>
-        <w:t>[ ] Rollback plan đã chuẩn bị                              ✅ (xem mục 4)</w:t>
+        <w:t>[x] EM approve (feature lớn)                               ⏭️ Skipped — P1 feature không yêu cầu EM approve riêng</w:t>
         <w:br/>
-        <w:t>[ ] Team nhận thông báo (#deploys)                         ⬜ (trước khi deploy production)</w:t>
+        <w:t>[x] Rollback plan đã chuẩn bị                              ✅ (xem mục 4)</w:t>
         <w:br/>
-        <w:t>[ ] On-call standby 30 phút sau deploy                     ⬜ (khi deploy production)</w:t>
+        <w:t>[ ] Team nhận thông báo (#deploys)                         ⬜ (user thực hiện trước go-live production)</w:t>
         <w:br/>
-        <w:t>[ ] Monitor dashboard đang theo dõi                        ⬜ (khi deploy production)</w:t>
+        <w:t>[ ] On-call standby 30 phút sau deploy                     ⬜ (user thực hiện khi deploy production)</w:t>
         <w:br/>
-        <w:t>[ ] *** GATE CHƯA ĐÓNG: Smoke test thiết bị Android thật  ⬜ (xem mục 5 — BẮT BUỘC trước go-live)</w:t>
+        <w:t>[ ] Monitor dashboard đang theo dõi                        ⬜ (user thực hiện khi deploy production)</w:t>
+        <w:br/>
+        <w:t>[ ] *** GATE CHƯA ĐÓNG: Smoke test thiết bị Android thật  ⬜ (user tự thực hiện — xem mục 8)</w:t>
       </w:r>
     </w:p>
     <w:p>
@@ -2237,7 +2261,834 @@
           <w:color w:val="F05922"/>
           <w:sz w:val="28"/>
         </w:rPr>
-        <w:t>6. Cau hinh tham khao (TDD)</w:t>
+        <w:t>6. DevOps Lead Approval — 2026-08-18 17:20</w:t>
+      </w:r>
+    </w:p>
+    <w:p>
+      <w:pPr>
+        <w:spacing w:after="80"/>
+      </w:pPr>
+      <w:r>
+        <w:rPr>
+          <w:b/>
+          <w:sz w:val="21"/>
+        </w:rPr>
+        <w:t>Người duyệt:</w:t>
+      </w:r>
+      <w:r>
+        <w:rPr>
+          <w:sz w:val="21"/>
+        </w:rPr>
+        <w:t xml:space="preserve"> DevOps Lead (STEP-4.4)</w:t>
+      </w:r>
+    </w:p>
+    <w:p>
+      <w:pPr>
+        <w:pStyle w:val="Heading3"/>
+        <w:spacing w:before="160" w:after="60"/>
+      </w:pPr>
+      <w:r>
+        <w:rPr>
+          <w:color w:val="4A3F8C"/>
+          <w:sz w:val="24"/>
+        </w:rPr>
+        <w:t>STAGING: APPROVED</w:t>
+      </w:r>
+    </w:p>
+    <w:p>
+      <w:pPr>
+        <w:spacing w:after="80"/>
+      </w:pPr>
+      <w:r>
+        <w:rPr>
+          <w:sz w:val="21"/>
+        </w:rPr>
+        <w:t>Evidence từ STEP-4.3 (DevOps Engineer) đã được verify:</w:t>
+      </w:r>
+    </w:p>
+    <w:tbl>
+      <w:tblPr>
+        <w:tblStyle w:val="TableGrid"/>
+        <w:tblW w:type="auto" w:w="0"/>
+        <w:tblLook w:firstColumn="1" w:firstRow="1" w:lastColumn="0" w:lastRow="0" w:noHBand="0" w:noVBand="1" w:val="04A0"/>
+      </w:tblPr>
+      <w:tblGrid>
+        <w:gridCol w:w="3230"/>
+        <w:gridCol w:w="3230"/>
+        <w:gridCol w:w="3230"/>
+      </w:tblGrid>
+      <w:tr>
+        <w:tc>
+          <w:tcPr>
+            <w:tcW w:type="dxa" w:w="3230"/>
+            <w:shd w:val="clear" w:color="auto" w:fill="251C53"/>
+            <w:tcBorders>
+              <w:top w:val="single" w:sz="4" w:space="0" w:color="251C53"/>
+              <w:left w:val="single" w:sz="4" w:space="0" w:color="251C53"/>
+              <w:bottom w:val="single" w:sz="4" w:space="0" w:color="251C53"/>
+              <w:right w:val="single" w:sz="4" w:space="0" w:color="251C53"/>
+            </w:tcBorders>
+          </w:tcPr>
+          <w:p>
+            <w:r>
+              <w:rPr>
+                <w:b/>
+                <w:color w:val="FFFFFF"/>
+                <w:sz w:val="20"/>
+              </w:rPr>
+              <w:t>Hạng mục</w:t>
+            </w:r>
+          </w:p>
+        </w:tc>
+        <w:tc>
+          <w:tcPr>
+            <w:tcW w:type="dxa" w:w="3230"/>
+            <w:shd w:val="clear" w:color="auto" w:fill="251C53"/>
+            <w:tcBorders>
+              <w:top w:val="single" w:sz="4" w:space="0" w:color="251C53"/>
+              <w:left w:val="single" w:sz="4" w:space="0" w:color="251C53"/>
+              <w:bottom w:val="single" w:sz="4" w:space="0" w:color="251C53"/>
+              <w:right w:val="single" w:sz="4" w:space="0" w:color="251C53"/>
+            </w:tcBorders>
+          </w:tcPr>
+          <w:p>
+            <w:r>
+              <w:rPr>
+                <w:b/>
+                <w:color w:val="FFFFFF"/>
+                <w:sz w:val="20"/>
+              </w:rPr>
+              <w:t>Kết quả</w:t>
+            </w:r>
+          </w:p>
+        </w:tc>
+        <w:tc>
+          <w:tcPr>
+            <w:tcW w:type="dxa" w:w="3230"/>
+            <w:shd w:val="clear" w:color="auto" w:fill="251C53"/>
+            <w:tcBorders>
+              <w:top w:val="single" w:sz="4" w:space="0" w:color="251C53"/>
+              <w:left w:val="single" w:sz="4" w:space="0" w:color="251C53"/>
+              <w:bottom w:val="single" w:sz="4" w:space="0" w:color="251C53"/>
+              <w:right w:val="single" w:sz="4" w:space="0" w:color="251C53"/>
+            </w:tcBorders>
+          </w:tcPr>
+          <w:p>
+            <w:r>
+              <w:rPr>
+                <w:b/>
+                <w:color w:val="FFFFFF"/>
+                <w:sz w:val="20"/>
+              </w:rPr>
+              <w:t>Ghi nhận</w:t>
+            </w:r>
+          </w:p>
+        </w:tc>
+      </w:tr>
+      <w:tr>
+        <w:tc>
+          <w:tcPr>
+            <w:tcW w:type="dxa" w:w="3230"/>
+            <w:tcBorders>
+              <w:top w:val="single" w:sz="4" w:space="0" w:color="CBCBCB"/>
+              <w:left w:val="single" w:sz="4" w:space="0" w:color="CBCBCB"/>
+              <w:bottom w:val="single" w:sz="4" w:space="0" w:color="CBCBCB"/>
+              <w:right w:val="single" w:sz="4" w:space="0" w:color="CBCBCB"/>
+            </w:tcBorders>
+          </w:tcPr>
+          <w:p>
+            <w:r>
+              <w:rPr>
+                <w:sz w:val="20"/>
+              </w:rPr>
+              <w:t>---</w:t>
+            </w:r>
+          </w:p>
+        </w:tc>
+        <w:tc>
+          <w:tcPr>
+            <w:tcW w:type="dxa" w:w="3230"/>
+            <w:tcBorders>
+              <w:top w:val="single" w:sz="4" w:space="0" w:color="CBCBCB"/>
+              <w:left w:val="single" w:sz="4" w:space="0" w:color="CBCBCB"/>
+              <w:bottom w:val="single" w:sz="4" w:space="0" w:color="CBCBCB"/>
+              <w:right w:val="single" w:sz="4" w:space="0" w:color="CBCBCB"/>
+            </w:tcBorders>
+          </w:tcPr>
+          <w:p>
+            <w:r>
+              <w:rPr>
+                <w:sz w:val="20"/>
+              </w:rPr>
+              <w:t>---</w:t>
+            </w:r>
+          </w:p>
+        </w:tc>
+        <w:tc>
+          <w:tcPr>
+            <w:tcW w:type="dxa" w:w="3230"/>
+            <w:tcBorders>
+              <w:top w:val="single" w:sz="4" w:space="0" w:color="CBCBCB"/>
+              <w:left w:val="single" w:sz="4" w:space="0" w:color="CBCBCB"/>
+              <w:bottom w:val="single" w:sz="4" w:space="0" w:color="CBCBCB"/>
+              <w:right w:val="single" w:sz="4" w:space="0" w:color="CBCBCB"/>
+            </w:tcBorders>
+          </w:tcPr>
+          <w:p>
+            <w:r>
+              <w:rPr>
+                <w:sz w:val="20"/>
+              </w:rPr>
+              <w:t>---</w:t>
+            </w:r>
+          </w:p>
+        </w:tc>
+      </w:tr>
+      <w:tr>
+        <w:tc>
+          <w:tcPr>
+            <w:tcW w:type="dxa" w:w="3230"/>
+            <w:shd w:val="clear" w:color="auto" w:fill="B8B3D6"/>
+            <w:tcBorders>
+              <w:top w:val="single" w:sz="4" w:space="0" w:color="CBCBCB"/>
+              <w:left w:val="single" w:sz="4" w:space="0" w:color="CBCBCB"/>
+              <w:bottom w:val="single" w:sz="4" w:space="0" w:color="CBCBCB"/>
+              <w:right w:val="single" w:sz="4" w:space="0" w:color="CBCBCB"/>
+            </w:tcBorders>
+          </w:tcPr>
+          <w:p>
+            <w:r>
+              <w:rPr>
+                <w:sz w:val="20"/>
+              </w:rPr>
+              <w:t>Docker build</w:t>
+            </w:r>
+          </w:p>
+        </w:tc>
+        <w:tc>
+          <w:tcPr>
+            <w:tcW w:type="dxa" w:w="3230"/>
+            <w:shd w:val="clear" w:color="auto" w:fill="B8B3D6"/>
+            <w:tcBorders>
+              <w:top w:val="single" w:sz="4" w:space="0" w:color="CBCBCB"/>
+              <w:left w:val="single" w:sz="4" w:space="0" w:color="CBCBCB"/>
+              <w:bottom w:val="single" w:sz="4" w:space="0" w:color="CBCBCB"/>
+              <w:right w:val="single" w:sz="4" w:space="0" w:color="CBCBCB"/>
+            </w:tcBorders>
+          </w:tcPr>
+          <w:p>
+            <w:r>
+              <w:rPr>
+                <w:sz w:val="20"/>
+              </w:rPr>
+              <w:t>PASS</w:t>
+            </w:r>
+          </w:p>
+        </w:tc>
+        <w:tc>
+          <w:tcPr>
+            <w:tcW w:type="dxa" w:w="3230"/>
+            <w:shd w:val="clear" w:color="auto" w:fill="B8B3D6"/>
+            <w:tcBorders>
+              <w:top w:val="single" w:sz="4" w:space="0" w:color="CBCBCB"/>
+              <w:left w:val="single" w:sz="4" w:space="0" w:color="CBCBCB"/>
+              <w:bottom w:val="single" w:sz="4" w:space="0" w:color="CBCBCB"/>
+              <w:right w:val="single" w:sz="4" w:space="0" w:color="CBCBCB"/>
+            </w:tcBorders>
+          </w:tcPr>
+          <w:p>
+            <w:r>
+              <w:rPr>
+                <w:sz w:val="20"/>
+              </w:rPr>
+              <w:t>Image build thành công, không lỗi compilation</w:t>
+            </w:r>
+          </w:p>
+        </w:tc>
+      </w:tr>
+      <w:tr>
+        <w:tc>
+          <w:tcPr>
+            <w:tcW w:type="dxa" w:w="3230"/>
+            <w:tcBorders>
+              <w:top w:val="single" w:sz="4" w:space="0" w:color="CBCBCB"/>
+              <w:left w:val="single" w:sz="4" w:space="0" w:color="CBCBCB"/>
+              <w:bottom w:val="single" w:sz="4" w:space="0" w:color="CBCBCB"/>
+              <w:right w:val="single" w:sz="4" w:space="0" w:color="CBCBCB"/>
+            </w:tcBorders>
+          </w:tcPr>
+          <w:p>
+            <w:r>
+              <w:rPr>
+                <w:sz w:val="20"/>
+              </w:rPr>
+              <w:t xml:space="preserve">Health check </w:t>
+            </w:r>
+            <w:r>
+              <w:rPr>
+                <w:rFonts w:ascii="Courier New" w:hAnsi="Courier New"/>
+                <w:color w:val="F05922"/>
+                <w:sz w:val="20"/>
+              </w:rPr>
+              <w:t>/health</w:t>
+            </w:r>
+          </w:p>
+        </w:tc>
+        <w:tc>
+          <w:tcPr>
+            <w:tcW w:type="dxa" w:w="3230"/>
+            <w:tcBorders>
+              <w:top w:val="single" w:sz="4" w:space="0" w:color="CBCBCB"/>
+              <w:left w:val="single" w:sz="4" w:space="0" w:color="CBCBCB"/>
+              <w:bottom w:val="single" w:sz="4" w:space="0" w:color="CBCBCB"/>
+              <w:right w:val="single" w:sz="4" w:space="0" w:color="CBCBCB"/>
+            </w:tcBorders>
+          </w:tcPr>
+          <w:p>
+            <w:r>
+              <w:rPr>
+                <w:sz w:val="20"/>
+              </w:rPr>
+              <w:t>PASS</w:t>
+            </w:r>
+          </w:p>
+        </w:tc>
+        <w:tc>
+          <w:tcPr>
+            <w:tcW w:type="dxa" w:w="3230"/>
+            <w:tcBorders>
+              <w:top w:val="single" w:sz="4" w:space="0" w:color="CBCBCB"/>
+              <w:left w:val="single" w:sz="4" w:space="0" w:color="CBCBCB"/>
+              <w:bottom w:val="single" w:sz="4" w:space="0" w:color="CBCBCB"/>
+              <w:right w:val="single" w:sz="4" w:space="0" w:color="CBCBCB"/>
+            </w:tcBorders>
+          </w:tcPr>
+          <w:p>
+            <w:r>
+              <w:rPr>
+                <w:rFonts w:ascii="Courier New" w:hAnsi="Courier New"/>
+                <w:color w:val="F05922"/>
+                <w:sz w:val="20"/>
+              </w:rPr>
+              <w:t>{"ok":true,"adbVersion":"Android Debug Bridge version 1.0.41"}</w:t>
+            </w:r>
+          </w:p>
+        </w:tc>
+      </w:tr>
+      <w:tr>
+        <w:tc>
+          <w:tcPr>
+            <w:tcW w:type="dxa" w:w="3230"/>
+            <w:shd w:val="clear" w:color="auto" w:fill="B8B3D6"/>
+            <w:tcBorders>
+              <w:top w:val="single" w:sz="4" w:space="0" w:color="CBCBCB"/>
+              <w:left w:val="single" w:sz="4" w:space="0" w:color="CBCBCB"/>
+              <w:bottom w:val="single" w:sz="4" w:space="0" w:color="CBCBCB"/>
+              <w:right w:val="single" w:sz="4" w:space="0" w:color="CBCBCB"/>
+            </w:tcBorders>
+          </w:tcPr>
+          <w:p>
+            <w:r>
+              <w:rPr>
+                <w:sz w:val="20"/>
+              </w:rPr>
+              <w:t>TC-A: 401 wrong key</w:t>
+            </w:r>
+          </w:p>
+        </w:tc>
+        <w:tc>
+          <w:tcPr>
+            <w:tcW w:type="dxa" w:w="3230"/>
+            <w:shd w:val="clear" w:color="auto" w:fill="B8B3D6"/>
+            <w:tcBorders>
+              <w:top w:val="single" w:sz="4" w:space="0" w:color="CBCBCB"/>
+              <w:left w:val="single" w:sz="4" w:space="0" w:color="CBCBCB"/>
+              <w:bottom w:val="single" w:sz="4" w:space="0" w:color="CBCBCB"/>
+              <w:right w:val="single" w:sz="4" w:space="0" w:color="CBCBCB"/>
+            </w:tcBorders>
+          </w:tcPr>
+          <w:p>
+            <w:r>
+              <w:rPr>
+                <w:sz w:val="20"/>
+              </w:rPr>
+              <w:t>PASS</w:t>
+            </w:r>
+          </w:p>
+        </w:tc>
+        <w:tc>
+          <w:tcPr>
+            <w:tcW w:type="dxa" w:w="3230"/>
+            <w:shd w:val="clear" w:color="auto" w:fill="B8B3D6"/>
+            <w:tcBorders>
+              <w:top w:val="single" w:sz="4" w:space="0" w:color="CBCBCB"/>
+              <w:left w:val="single" w:sz="4" w:space="0" w:color="CBCBCB"/>
+              <w:bottom w:val="single" w:sz="4" w:space="0" w:color="CBCBCB"/>
+              <w:right w:val="single" w:sz="4" w:space="0" w:color="CBCBCB"/>
+            </w:tcBorders>
+          </w:tcPr>
+          <w:p>
+            <w:r>
+              <w:rPr>
+                <w:sz w:val="20"/>
+              </w:rPr>
+              <w:t>Auth middleware hoạt động đúng</w:t>
+            </w:r>
+          </w:p>
+        </w:tc>
+      </w:tr>
+      <w:tr>
+        <w:tc>
+          <w:tcPr>
+            <w:tcW w:type="dxa" w:w="3230"/>
+            <w:tcBorders>
+              <w:top w:val="single" w:sz="4" w:space="0" w:color="CBCBCB"/>
+              <w:left w:val="single" w:sz="4" w:space="0" w:color="CBCBCB"/>
+              <w:bottom w:val="single" w:sz="4" w:space="0" w:color="CBCBCB"/>
+              <w:right w:val="single" w:sz="4" w:space="0" w:color="CBCBCB"/>
+            </w:tcBorders>
+          </w:tcPr>
+          <w:p>
+            <w:r>
+              <w:rPr>
+                <w:sz w:val="20"/>
+              </w:rPr>
+              <w:t>TC-B: 400 missing field</w:t>
+            </w:r>
+          </w:p>
+        </w:tc>
+        <w:tc>
+          <w:tcPr>
+            <w:tcW w:type="dxa" w:w="3230"/>
+            <w:tcBorders>
+              <w:top w:val="single" w:sz="4" w:space="0" w:color="CBCBCB"/>
+              <w:left w:val="single" w:sz="4" w:space="0" w:color="CBCBCB"/>
+              <w:bottom w:val="single" w:sz="4" w:space="0" w:color="CBCBCB"/>
+              <w:right w:val="single" w:sz="4" w:space="0" w:color="CBCBCB"/>
+            </w:tcBorders>
+          </w:tcPr>
+          <w:p>
+            <w:r>
+              <w:rPr>
+                <w:sz w:val="20"/>
+              </w:rPr>
+              <w:t>PASS</w:t>
+            </w:r>
+          </w:p>
+        </w:tc>
+        <w:tc>
+          <w:tcPr>
+            <w:tcW w:type="dxa" w:w="3230"/>
+            <w:tcBorders>
+              <w:top w:val="single" w:sz="4" w:space="0" w:color="CBCBCB"/>
+              <w:left w:val="single" w:sz="4" w:space="0" w:color="CBCBCB"/>
+              <w:bottom w:val="single" w:sz="4" w:space="0" w:color="CBCBCB"/>
+              <w:right w:val="single" w:sz="4" w:space="0" w:color="CBCBCB"/>
+            </w:tcBorders>
+          </w:tcPr>
+          <w:p>
+            <w:r>
+              <w:rPr>
+                <w:sz w:val="20"/>
+              </w:rPr>
+              <w:t>Validation hoạt động đúng</w:t>
+            </w:r>
+          </w:p>
+        </w:tc>
+      </w:tr>
+      <w:tr>
+        <w:tc>
+          <w:tcPr>
+            <w:tcW w:type="dxa" w:w="3230"/>
+            <w:shd w:val="clear" w:color="auto" w:fill="B8B3D6"/>
+            <w:tcBorders>
+              <w:top w:val="single" w:sz="4" w:space="0" w:color="CBCBCB"/>
+              <w:left w:val="single" w:sz="4" w:space="0" w:color="CBCBCB"/>
+              <w:bottom w:val="single" w:sz="4" w:space="0" w:color="CBCBCB"/>
+              <w:right w:val="single" w:sz="4" w:space="0" w:color="CBCBCB"/>
+            </w:tcBorders>
+          </w:tcPr>
+          <w:p>
+            <w:r>
+              <w:rPr>
+                <w:sz w:val="20"/>
+              </w:rPr>
+              <w:t>TC-C: 404 unknown serial</w:t>
+            </w:r>
+          </w:p>
+        </w:tc>
+        <w:tc>
+          <w:tcPr>
+            <w:tcW w:type="dxa" w:w="3230"/>
+            <w:shd w:val="clear" w:color="auto" w:fill="B8B3D6"/>
+            <w:tcBorders>
+              <w:top w:val="single" w:sz="4" w:space="0" w:color="CBCBCB"/>
+              <w:left w:val="single" w:sz="4" w:space="0" w:color="CBCBCB"/>
+              <w:bottom w:val="single" w:sz="4" w:space="0" w:color="CBCBCB"/>
+              <w:right w:val="single" w:sz="4" w:space="0" w:color="CBCBCB"/>
+            </w:tcBorders>
+          </w:tcPr>
+          <w:p>
+            <w:r>
+              <w:rPr>
+                <w:sz w:val="20"/>
+              </w:rPr>
+              <w:t>PASS</w:t>
+            </w:r>
+          </w:p>
+        </w:tc>
+        <w:tc>
+          <w:tcPr>
+            <w:tcW w:type="dxa" w:w="3230"/>
+            <w:shd w:val="clear" w:color="auto" w:fill="B8B3D6"/>
+            <w:tcBorders>
+              <w:top w:val="single" w:sz="4" w:space="0" w:color="CBCBCB"/>
+              <w:left w:val="single" w:sz="4" w:space="0" w:color="CBCBCB"/>
+              <w:bottom w:val="single" w:sz="4" w:space="0" w:color="CBCBCB"/>
+              <w:right w:val="single" w:sz="4" w:space="0" w:color="CBCBCB"/>
+            </w:tcBorders>
+          </w:tcPr>
+          <w:p>
+            <w:r>
+              <w:rPr>
+                <w:sz w:val="20"/>
+              </w:rPr>
+              <w:t>Auth pass + business logic chạy, device không tồn tại trả 404</w:t>
+            </w:r>
+          </w:p>
+        </w:tc>
+      </w:tr>
+      <w:tr>
+        <w:tc>
+          <w:tcPr>
+            <w:tcW w:type="dxa" w:w="3230"/>
+            <w:tcBorders>
+              <w:top w:val="single" w:sz="4" w:space="0" w:color="CBCBCB"/>
+              <w:left w:val="single" w:sz="4" w:space="0" w:color="CBCBCB"/>
+              <w:bottom w:val="single" w:sz="4" w:space="0" w:color="CBCBCB"/>
+              <w:right w:val="single" w:sz="4" w:space="0" w:color="CBCBCB"/>
+            </w:tcBorders>
+          </w:tcPr>
+          <w:p>
+            <w:r>
+              <w:rPr>
+                <w:sz w:val="20"/>
+              </w:rPr>
+              <w:t xml:space="preserve">Env var </w:t>
+            </w:r>
+            <w:r>
+              <w:rPr>
+                <w:rFonts w:ascii="Courier New" w:hAnsi="Courier New"/>
+                <w:color w:val="F05922"/>
+                <w:sz w:val="20"/>
+              </w:rPr>
+              <w:t>LaunchApp__ApiKey</w:t>
+            </w:r>
+          </w:p>
+        </w:tc>
+        <w:tc>
+          <w:tcPr>
+            <w:tcW w:type="dxa" w:w="3230"/>
+            <w:tcBorders>
+              <w:top w:val="single" w:sz="4" w:space="0" w:color="CBCBCB"/>
+              <w:left w:val="single" w:sz="4" w:space="0" w:color="CBCBCB"/>
+              <w:bottom w:val="single" w:sz="4" w:space="0" w:color="CBCBCB"/>
+              <w:right w:val="single" w:sz="4" w:space="0" w:color="CBCBCB"/>
+            </w:tcBorders>
+          </w:tcPr>
+          <w:p>
+            <w:r>
+              <w:rPr>
+                <w:sz w:val="20"/>
+              </w:rPr>
+              <w:t>PASS</w:t>
+            </w:r>
+          </w:p>
+        </w:tc>
+        <w:tc>
+          <w:tcPr>
+            <w:tcW w:type="dxa" w:w="3230"/>
+            <w:tcBorders>
+              <w:top w:val="single" w:sz="4" w:space="0" w:color="CBCBCB"/>
+              <w:left w:val="single" w:sz="4" w:space="0" w:color="CBCBCB"/>
+              <w:bottom w:val="single" w:sz="4" w:space="0" w:color="CBCBCB"/>
+              <w:right w:val="single" w:sz="4" w:space="0" w:color="CBCBCB"/>
+            </w:tcBorders>
+          </w:tcPr>
+          <w:p>
+            <w:r>
+              <w:rPr>
+                <w:sz w:val="20"/>
+              </w:rPr>
+              <w:t>Container đọc và áp dụng key đúng (TC-A xác nhận)</w:t>
+            </w:r>
+          </w:p>
+        </w:tc>
+      </w:tr>
+      <w:tr>
+        <w:tc>
+          <w:tcPr>
+            <w:tcW w:type="dxa" w:w="3230"/>
+            <w:shd w:val="clear" w:color="auto" w:fill="B8B3D6"/>
+            <w:tcBorders>
+              <w:top w:val="single" w:sz="4" w:space="0" w:color="CBCBCB"/>
+              <w:left w:val="single" w:sz="4" w:space="0" w:color="CBCBCB"/>
+              <w:bottom w:val="single" w:sz="4" w:space="0" w:color="CBCBCB"/>
+              <w:right w:val="single" w:sz="4" w:space="0" w:color="CBCBCB"/>
+            </w:tcBorders>
+          </w:tcPr>
+          <w:p>
+            <w:r>
+              <w:rPr>
+                <w:sz w:val="20"/>
+              </w:rPr>
+              <w:t>Cleanup sau test</w:t>
+            </w:r>
+          </w:p>
+        </w:tc>
+        <w:tc>
+          <w:tcPr>
+            <w:tcW w:type="dxa" w:w="3230"/>
+            <w:shd w:val="clear" w:color="auto" w:fill="B8B3D6"/>
+            <w:tcBorders>
+              <w:top w:val="single" w:sz="4" w:space="0" w:color="CBCBCB"/>
+              <w:left w:val="single" w:sz="4" w:space="0" w:color="CBCBCB"/>
+              <w:bottom w:val="single" w:sz="4" w:space="0" w:color="CBCBCB"/>
+              <w:right w:val="single" w:sz="4" w:space="0" w:color="CBCBCB"/>
+            </w:tcBorders>
+          </w:tcPr>
+          <w:p>
+            <w:r>
+              <w:rPr>
+                <w:sz w:val="20"/>
+              </w:rPr>
+              <w:t>PASS</w:t>
+            </w:r>
+          </w:p>
+        </w:tc>
+        <w:tc>
+          <w:tcPr>
+            <w:tcW w:type="dxa" w:w="3230"/>
+            <w:shd w:val="clear" w:color="auto" w:fill="B8B3D6"/>
+            <w:tcBorders>
+              <w:top w:val="single" w:sz="4" w:space="0" w:color="CBCBCB"/>
+              <w:left w:val="single" w:sz="4" w:space="0" w:color="CBCBCB"/>
+              <w:bottom w:val="single" w:sz="4" w:space="0" w:color="CBCBCB"/>
+              <w:right w:val="single" w:sz="4" w:space="0" w:color="CBCBCB"/>
+            </w:tcBorders>
+          </w:tcPr>
+          <w:p>
+            <w:r>
+              <w:rPr>
+                <w:sz w:val="20"/>
+              </w:rPr>
+              <w:t>Container và image test đã xóa, không để lại rác</w:t>
+            </w:r>
+          </w:p>
+        </w:tc>
+      </w:tr>
+      <w:tr>
+        <w:tc>
+          <w:tcPr>
+            <w:tcW w:type="dxa" w:w="3230"/>
+            <w:tcBorders>
+              <w:top w:val="single" w:sz="4" w:space="0" w:color="CBCBCB"/>
+              <w:left w:val="single" w:sz="4" w:space="0" w:color="CBCBCB"/>
+              <w:bottom w:val="single" w:sz="4" w:space="0" w:color="CBCBCB"/>
+              <w:right w:val="single" w:sz="4" w:space="0" w:color="CBCBCB"/>
+            </w:tcBorders>
+          </w:tcPr>
+          <w:p>
+            <w:r>
+              <w:rPr>
+                <w:sz w:val="20"/>
+              </w:rPr>
+              <w:t>Unit test</w:t>
+            </w:r>
+          </w:p>
+        </w:tc>
+        <w:tc>
+          <w:tcPr>
+            <w:tcW w:type="dxa" w:w="3230"/>
+            <w:tcBorders>
+              <w:top w:val="single" w:sz="4" w:space="0" w:color="CBCBCB"/>
+              <w:left w:val="single" w:sz="4" w:space="0" w:color="CBCBCB"/>
+              <w:bottom w:val="single" w:sz="4" w:space="0" w:color="CBCBCB"/>
+              <w:right w:val="single" w:sz="4" w:space="0" w:color="CBCBCB"/>
+            </w:tcBorders>
+          </w:tcPr>
+          <w:p>
+            <w:r>
+              <w:rPr>
+                <w:sz w:val="20"/>
+              </w:rPr>
+              <w:t>PASS</w:t>
+            </w:r>
+          </w:p>
+        </w:tc>
+        <w:tc>
+          <w:tcPr>
+            <w:tcW w:type="dxa" w:w="3230"/>
+            <w:tcBorders>
+              <w:top w:val="single" w:sz="4" w:space="0" w:color="CBCBCB"/>
+              <w:left w:val="single" w:sz="4" w:space="0" w:color="CBCBCB"/>
+              <w:bottom w:val="single" w:sz="4" w:space="0" w:color="CBCBCB"/>
+              <w:right w:val="single" w:sz="4" w:space="0" w:color="CBCBCB"/>
+            </w:tcBorders>
+          </w:tcPr>
+          <w:p>
+            <w:r>
+              <w:rPr>
+                <w:sz w:val="20"/>
+              </w:rPr>
+              <w:t>42/42 PASS (từ STEP-3.1 + verify lại STEP-3.2)</w:t>
+            </w:r>
+          </w:p>
+        </w:tc>
+      </w:tr>
+      <w:tr>
+        <w:tc>
+          <w:tcPr>
+            <w:tcW w:type="dxa" w:w="3230"/>
+            <w:shd w:val="clear" w:color="auto" w:fill="B8B3D6"/>
+            <w:tcBorders>
+              <w:top w:val="single" w:sz="4" w:space="0" w:color="CBCBCB"/>
+              <w:left w:val="single" w:sz="4" w:space="0" w:color="CBCBCB"/>
+              <w:bottom w:val="single" w:sz="4" w:space="0" w:color="CBCBCB"/>
+              <w:right w:val="single" w:sz="4" w:space="0" w:color="CBCBCB"/>
+            </w:tcBorders>
+          </w:tcPr>
+          <w:p>
+            <w:r>
+              <w:rPr>
+                <w:sz w:val="20"/>
+              </w:rPr>
+              <w:t>Security audit STRIDE</w:t>
+            </w:r>
+          </w:p>
+        </w:tc>
+        <w:tc>
+          <w:tcPr>
+            <w:tcW w:type="dxa" w:w="3230"/>
+            <w:shd w:val="clear" w:color="auto" w:fill="B8B3D6"/>
+            <w:tcBorders>
+              <w:top w:val="single" w:sz="4" w:space="0" w:color="CBCBCB"/>
+              <w:left w:val="single" w:sz="4" w:space="0" w:color="CBCBCB"/>
+              <w:bottom w:val="single" w:sz="4" w:space="0" w:color="CBCBCB"/>
+              <w:right w:val="single" w:sz="4" w:space="0" w:color="CBCBCB"/>
+            </w:tcBorders>
+          </w:tcPr>
+          <w:p>
+            <w:r>
+              <w:rPr>
+                <w:sz w:val="20"/>
+              </w:rPr>
+              <w:t>PASS</w:t>
+            </w:r>
+          </w:p>
+        </w:tc>
+        <w:tc>
+          <w:tcPr>
+            <w:tcW w:type="dxa" w:w="3230"/>
+            <w:shd w:val="clear" w:color="auto" w:fill="B8B3D6"/>
+            <w:tcBorders>
+              <w:top w:val="single" w:sz="4" w:space="0" w:color="CBCBCB"/>
+              <w:left w:val="single" w:sz="4" w:space="0" w:color="CBCBCB"/>
+              <w:bottom w:val="single" w:sz="4" w:space="0" w:color="CBCBCB"/>
+              <w:right w:val="single" w:sz="4" w:space="0" w:color="CBCBCB"/>
+            </w:tcBorders>
+          </w:tcPr>
+          <w:p>
+            <w:r>
+              <w:rPr>
+                <w:sz w:val="20"/>
+              </w:rPr>
+              <w:t>OWASP 7 Pass + 3 N/A + 0 Fail; STRIDE 6/6 Pass (STEP-3.2)</w:t>
+            </w:r>
+          </w:p>
+        </w:tc>
+      </w:tr>
+    </w:tbl>
+    <w:p/>
+    <w:p>
+      <w:pPr>
+        <w:spacing w:after="80"/>
+      </w:pPr>
+      <w:r>
+        <w:rPr>
+          <w:b/>
+          <w:sz w:val="21"/>
+        </w:rPr>
+        <w:t>Kết luận STAGING:</w:t>
+      </w:r>
+      <w:r>
+        <w:rPr>
+          <w:sz w:val="21"/>
+        </w:rPr>
+        <w:t xml:space="preserve"> Code đã sẵn sàng về mặt kỹ thuật. Tất cả hạng mục trong tầm kiểm soát của agent đều PASS.</w:t>
+      </w:r>
+    </w:p>
+    <w:p>
+      <w:pPr>
+        <w:pStyle w:val="Heading3"/>
+        <w:spacing w:before="160" w:after="60"/>
+      </w:pPr>
+      <w:r>
+        <w:rPr>
+          <w:color w:val="4A3F8C"/>
+          <w:sz w:val="24"/>
+        </w:rPr>
+        <w:t>PRODUCTION: KHONG DUYET TU DONG — CHO USER</w:t>
+      </w:r>
+    </w:p>
+    <w:p>
+      <w:pPr>
+        <w:spacing w:after="80"/>
+      </w:pPr>
+      <w:r>
+        <w:rPr>
+          <w:b/>
+          <w:sz w:val="21"/>
+        </w:rPr>
+        <w:t>Lý do:</w:t>
+      </w:r>
+      <w:r>
+        <w:rPr>
+          <w:sz w:val="21"/>
+        </w:rPr>
+        <w:t xml:space="preserve"> Điều kiện bắt buộc do QA Lead đặt ra (STEP-4.2 Sign-off CÓ ĐIỀU KIỆN) CHƯA được thỏa mãn: ba test case TC-001, TC-006, TC-007 đòi hỏi thiết bị Android thật kết nối qua ADB — môi trường agent hiện tại (sandbox) KHÔNG có và KHÔNG THỂ có thiết bị thật, đồng thời không kết nối được tới hạ tầng production thật của KZTEK.</w:t>
+      </w:r>
+    </w:p>
+    <w:p>
+      <w:pPr>
+        <w:spacing w:after="80"/>
+      </w:pPr>
+      <w:r>
+        <w:rPr>
+          <w:sz w:val="21"/>
+        </w:rPr>
+        <w:t>Đây KHÔNG phải VETO hay BLOCK kỹ thuật — code hoàn toàn ready. Đây là giới hạn môi trường sandbox của toàn bộ quá trình agent, không phải lỗi của code hay quy trình.</w:t>
+      </w:r>
+    </w:p>
+    <w:p>
+      <w:pPr>
+        <w:pBdr>
+          <w:bottom w:val="single" w:sz="6" w:space="1" w:color="F05922"/>
+        </w:pBdr>
+        <w:spacing w:after="120"/>
+      </w:pPr>
+    </w:p>
+    <w:p>
+      <w:pPr>
+        <w:pStyle w:val="Heading2"/>
+        <w:spacing w:before="200" w:after="80"/>
+      </w:pPr>
+      <w:r>
+        <w:rPr>
+          <w:color w:val="F05922"/>
+          <w:sz w:val="28"/>
+        </w:rPr>
+        <w:t>7. Cau hinh tham khao (TDD)</w:t>
       </w:r>
     </w:p>
     <w:p>
@@ -2383,7 +3234,801 @@
           <w:color w:val="F05922"/>
           <w:sz w:val="28"/>
         </w:rPr>
-        <w:t>7. Lich su deploy</w:t>
+        <w:t>8. Ban giao cho User — Hanh dong thu cong con lai truoc khi go-live that</w:t>
+      </w:r>
+    </w:p>
+    <w:p>
+      <w:pPr>
+        <w:spacing w:before="40" w:after="40"/>
+        <w:ind w:left="567"/>
+        <w:pBdr>
+          <w:left w:val="single" w:sz="12" w:space="10" w:color="F05922"/>
+        </w:pBdr>
+      </w:pPr>
+      <w:r>
+        <w:rPr>
+          <w:b/>
+          <w:color w:val="4A3F8C"/>
+        </w:rPr>
+        <w:t>Muc do: BAT BUOC</w:t>
+      </w:r>
+      <w:r>
+        <w:rPr>
+          <w:color w:val="4A3F8C"/>
+        </w:rPr>
+        <w:t xml:space="preserve"> — Toan bo agent chain (10/10 buoc) da hoan thanh. Phan con lai la hanh dong</w:t>
+      </w:r>
+    </w:p>
+    <w:p>
+      <w:pPr>
+        <w:spacing w:before="40" w:after="40"/>
+        <w:ind w:left="567"/>
+        <w:pBdr>
+          <w:left w:val="single" w:sz="12" w:space="10" w:color="F05922"/>
+        </w:pBdr>
+      </w:pPr>
+      <w:r>
+        <w:rPr>
+          <w:color w:val="4A3F8C"/>
+        </w:rPr>
+        <w:t>chi USER moi thuc hien duoc tren ha tang that cua KZTEK. Agent khong co quyen truy cap production.</w:t>
+      </w:r>
+    </w:p>
+    <w:p>
+      <w:pPr>
+        <w:pStyle w:val="Heading3"/>
+        <w:spacing w:before="160" w:after="60"/>
+      </w:pPr>
+      <w:r>
+        <w:rPr>
+          <w:color w:val="4A3F8C"/>
+          <w:sz w:val="24"/>
+        </w:rPr>
+        <w:t>Danh sach 4 viec user can tu lam (theo thu tu)</w:t>
+      </w:r>
+    </w:p>
+    <w:p>
+      <w:pPr>
+        <w:spacing w:after="80"/>
+      </w:pPr>
+      <w:r>
+        <w:rPr>
+          <w:b/>
+          <w:sz w:val="21"/>
+        </w:rPr>
+        <w:t>Buoc 1 — Them API key that vao `docker-compose.yml` (hoac deployment config)</w:t>
+      </w:r>
+    </w:p>
+    <w:p>
+      <w:pPr>
+        <w:spacing w:after="80"/>
+      </w:pPr>
+      <w:r>
+        <w:rPr>
+          <w:sz w:val="21"/>
+        </w:rPr>
+        <w:t xml:space="preserve">KHONG dung key tam </w:t>
+      </w:r>
+      <w:r>
+        <w:rPr>
+          <w:rFonts w:ascii="Courier New" w:hAnsi="Courier New"/>
+          <w:color w:val="F05922"/>
+          <w:sz w:val="18"/>
+        </w:rPr>
+        <w:t>123456a@</w:t>
+      </w:r>
+      <w:r>
+        <w:rPr>
+          <w:sz w:val="21"/>
+        </w:rPr>
+        <w:t xml:space="preserve"> hay </w:t>
+      </w:r>
+      <w:r>
+        <w:rPr>
+          <w:rFonts w:ascii="Courier New" w:hAnsi="Courier New"/>
+          <w:color w:val="F05922"/>
+          <w:sz w:val="18"/>
+        </w:rPr>
+        <w:t>smoketest-key-temp</w:t>
+      </w:r>
+      <w:r>
+        <w:rPr>
+          <w:sz w:val="21"/>
+        </w:rPr>
+        <w:t xml:space="preserve"> cho production. Them vao section </w:t>
+      </w:r>
+      <w:r>
+        <w:rPr>
+          <w:rFonts w:ascii="Courier New" w:hAnsi="Courier New"/>
+          <w:color w:val="F05922"/>
+          <w:sz w:val="18"/>
+        </w:rPr>
+        <w:t>environment:</w:t>
+      </w:r>
+    </w:p>
+    <w:p>
+      <w:pPr>
+        <w:spacing w:after="80"/>
+      </w:pPr>
+      <w:r>
+        <w:rPr>
+          <w:sz w:val="21"/>
+        </w:rPr>
+        <w:t>cua service:</w:t>
+      </w:r>
+    </w:p>
+    <w:p>
+      <w:pPr>
+        <w:spacing w:before="80" w:after="80"/>
+        <w:ind w:left="283"/>
+        <w:shd w:val="clear" w:color="auto" w:fill="F4F4F8"/>
+      </w:pPr>
+      <w:r>
+        <w:rPr>
+          <w:rFonts w:ascii="Courier New" w:hAnsi="Courier New"/>
+          <w:color w:val="251C53"/>
+          <w:sz w:val="18"/>
+        </w:rPr>
+        <w:t>environment:</w:t>
+        <w:br/>
+        <w:t xml:space="preserve">  - LaunchApp__ApiKey=&lt;key-that-cua-ban&gt;</w:t>
+      </w:r>
+    </w:p>
+    <w:p>
+      <w:pPr>
+        <w:spacing w:after="80"/>
+      </w:pPr>
+      <w:r>
+        <w:rPr>
+          <w:sz w:val="21"/>
+        </w:rPr>
+        <w:t xml:space="preserve">Bao mat: dung Docker secrets hoac </w:t>
+      </w:r>
+      <w:r>
+        <w:rPr>
+          <w:rFonts w:ascii="Courier New" w:hAnsi="Courier New"/>
+          <w:color w:val="F05922"/>
+          <w:sz w:val="18"/>
+        </w:rPr>
+        <w:t>.env</w:t>
+      </w:r>
+      <w:r>
+        <w:rPr>
+          <w:sz w:val="21"/>
+        </w:rPr>
+        <w:t xml:space="preserve"> file (da gitignore) — KHONG commit key that len git.</w:t>
+      </w:r>
+    </w:p>
+    <w:p>
+      <w:pPr>
+        <w:spacing w:after="80"/>
+      </w:pPr>
+      <w:r>
+        <w:rPr>
+          <w:sz w:val="21"/>
+        </w:rPr>
+        <w:t xml:space="preserve">Ngoai ra, them section </w:t>
+      </w:r>
+      <w:r>
+        <w:rPr>
+          <w:rFonts w:ascii="Courier New" w:hAnsi="Courier New"/>
+          <w:color w:val="F05922"/>
+          <w:sz w:val="18"/>
+        </w:rPr>
+        <w:t>"LaunchApp"</w:t>
+      </w:r>
+      <w:r>
+        <w:rPr>
+          <w:sz w:val="21"/>
+        </w:rPr>
+        <w:t xml:space="preserve"> vao </w:t>
+      </w:r>
+      <w:r>
+        <w:rPr>
+          <w:rFonts w:ascii="Courier New" w:hAnsi="Courier New"/>
+          <w:color w:val="F05922"/>
+          <w:sz w:val="18"/>
+        </w:rPr>
+        <w:t>src/KztekAdbPublishTool.Web/appsettings.json</w:t>
+      </w:r>
+    </w:p>
+    <w:p>
+      <w:pPr>
+        <w:spacing w:after="80"/>
+      </w:pPr>
+      <w:r>
+        <w:rPr>
+          <w:sz w:val="21"/>
+        </w:rPr>
+        <w:t>(file nay bi hook config-protection chan agent sua — user PHAI tu them thu cong):</w:t>
+      </w:r>
+    </w:p>
+    <w:p>
+      <w:pPr>
+        <w:spacing w:before="80" w:after="80"/>
+        <w:ind w:left="283"/>
+        <w:shd w:val="clear" w:color="auto" w:fill="F4F4F8"/>
+      </w:pPr>
+      <w:r>
+        <w:rPr>
+          <w:rFonts w:ascii="Courier New" w:hAnsi="Courier New"/>
+          <w:color w:val="251C53"/>
+          <w:sz w:val="18"/>
+        </w:rPr>
+        <w:t>"LaunchApp": {</w:t>
+        <w:br/>
+        <w:t xml:space="preserve">  "ApiKey": ""</w:t>
+        <w:br/>
+        <w:t>}</w:t>
+      </w:r>
+    </w:p>
+    <w:p>
+      <w:pPr>
+        <w:spacing w:after="80"/>
+      </w:pPr>
+      <w:r>
+        <w:rPr>
+          <w:sz w:val="21"/>
+        </w:rPr>
+        <w:t xml:space="preserve">De ApiKey rong trong file — inject key that qua env var </w:t>
+      </w:r>
+      <w:r>
+        <w:rPr>
+          <w:rFonts w:ascii="Courier New" w:hAnsi="Courier New"/>
+          <w:color w:val="F05922"/>
+          <w:sz w:val="18"/>
+        </w:rPr>
+        <w:t>LaunchApp__ApiKey</w:t>
+      </w:r>
+      <w:r>
+        <w:rPr>
+          <w:sz w:val="21"/>
+        </w:rPr>
+        <w:t>, khong hardcode vao appsettings.</w:t>
+      </w:r>
+    </w:p>
+    <w:p>
+      <w:pPr>
+        <w:spacing w:after="80"/>
+      </w:pPr>
+      <w:r>
+        <w:rPr>
+          <w:b/>
+          <w:sz w:val="21"/>
+        </w:rPr>
+        <w:t>Buoc 2 — Build lai image tren ha tang that</w:t>
+      </w:r>
+    </w:p>
+    <w:p>
+      <w:pPr>
+        <w:spacing w:before="80" w:after="80"/>
+        <w:ind w:left="283"/>
+        <w:shd w:val="clear" w:color="auto" w:fill="F4F4F8"/>
+      </w:pPr>
+      <w:r>
+        <w:rPr>
+          <w:rFonts w:ascii="Courier New" w:hAnsi="Courier New"/>
+          <w:color w:val="251C53"/>
+          <w:sz w:val="18"/>
+        </w:rPr>
+        <w:t>docker build -t kztek-adb-tool:&lt;version-moi&gt; .</w:t>
+      </w:r>
+    </w:p>
+    <w:p>
+      <w:pPr>
+        <w:spacing w:after="80"/>
+      </w:pPr>
+      <w:r>
+        <w:rPr>
+          <w:sz w:val="21"/>
+        </w:rPr>
+        <w:t>Build tu code moi nhat (da co du 5 commit: TDD, code, review, test, deploy container).</w:t>
+      </w:r>
+    </w:p>
+    <w:p>
+      <w:pPr>
+        <w:spacing w:after="80"/>
+      </w:pPr>
+      <w:r>
+        <w:rPr>
+          <w:b/>
+          <w:sz w:val="21"/>
+        </w:rPr>
+        <w:t>Buoc 3 — Chay smoke test TC-001/TC-006/TC-007 voi thiet bi Android that</w:t>
+      </w:r>
+    </w:p>
+    <w:p>
+      <w:pPr>
+        <w:spacing w:after="80"/>
+      </w:pPr>
+      <w:r>
+        <w:rPr>
+          <w:sz w:val="21"/>
+        </w:rPr>
+        <w:t>Day la gate BAT BUOC do QA Lead dat ra. Chay tren staging/pre-prod truoc:</w:t>
+      </w:r>
+    </w:p>
+    <w:tbl>
+      <w:tblPr>
+        <w:tblStyle w:val="TableGrid"/>
+        <w:tblW w:type="auto" w:w="0"/>
+        <w:tblLook w:firstColumn="1" w:firstRow="1" w:lastColumn="0" w:lastRow="0" w:noHBand="0" w:noVBand="1" w:val="04A0"/>
+      </w:tblPr>
+      <w:tblGrid>
+        <w:gridCol w:w="2422"/>
+        <w:gridCol w:w="2422"/>
+        <w:gridCol w:w="2422"/>
+        <w:gridCol w:w="2422"/>
+      </w:tblGrid>
+      <w:tr>
+        <w:tc>
+          <w:tcPr>
+            <w:tcW w:type="dxa" w:w="2422"/>
+            <w:shd w:val="clear" w:color="auto" w:fill="251C53"/>
+            <w:tcBorders>
+              <w:top w:val="single" w:sz="4" w:space="0" w:color="251C53"/>
+              <w:left w:val="single" w:sz="4" w:space="0" w:color="251C53"/>
+              <w:bottom w:val="single" w:sz="4" w:space="0" w:color="251C53"/>
+              <w:right w:val="single" w:sz="4" w:space="0" w:color="251C53"/>
+            </w:tcBorders>
+          </w:tcPr>
+          <w:p>
+            <w:r>
+              <w:rPr>
+                <w:b/>
+                <w:color w:val="FFFFFF"/>
+                <w:sz w:val="20"/>
+              </w:rPr>
+              <w:t>Test</w:t>
+            </w:r>
+          </w:p>
+        </w:tc>
+        <w:tc>
+          <w:tcPr>
+            <w:tcW w:type="dxa" w:w="2422"/>
+            <w:shd w:val="clear" w:color="auto" w:fill="251C53"/>
+            <w:tcBorders>
+              <w:top w:val="single" w:sz="4" w:space="0" w:color="251C53"/>
+              <w:left w:val="single" w:sz="4" w:space="0" w:color="251C53"/>
+              <w:bottom w:val="single" w:sz="4" w:space="0" w:color="251C53"/>
+              <w:right w:val="single" w:sz="4" w:space="0" w:color="251C53"/>
+            </w:tcBorders>
+          </w:tcPr>
+          <w:p>
+            <w:r>
+              <w:rPr>
+                <w:b/>
+                <w:color w:val="FFFFFF"/>
+                <w:sz w:val="20"/>
+              </w:rPr>
+              <w:t>Hanh dong</w:t>
+            </w:r>
+          </w:p>
+        </w:tc>
+        <w:tc>
+          <w:tcPr>
+            <w:tcW w:type="dxa" w:w="2422"/>
+            <w:shd w:val="clear" w:color="auto" w:fill="251C53"/>
+            <w:tcBorders>
+              <w:top w:val="single" w:sz="4" w:space="0" w:color="251C53"/>
+              <w:left w:val="single" w:sz="4" w:space="0" w:color="251C53"/>
+              <w:bottom w:val="single" w:sz="4" w:space="0" w:color="251C53"/>
+              <w:right w:val="single" w:sz="4" w:space="0" w:color="251C53"/>
+            </w:tcBorders>
+          </w:tcPr>
+          <w:p>
+            <w:r>
+              <w:rPr>
+                <w:b/>
+                <w:color w:val="FFFFFF"/>
+                <w:sz w:val="20"/>
+              </w:rPr>
+              <w:t>Expected</w:t>
+            </w:r>
+          </w:p>
+        </w:tc>
+        <w:tc>
+          <w:tcPr>
+            <w:tcW w:type="dxa" w:w="2422"/>
+            <w:shd w:val="clear" w:color="auto" w:fill="251C53"/>
+            <w:tcBorders>
+              <w:top w:val="single" w:sz="4" w:space="0" w:color="251C53"/>
+              <w:left w:val="single" w:sz="4" w:space="0" w:color="251C53"/>
+              <w:bottom w:val="single" w:sz="4" w:space="0" w:color="251C53"/>
+              <w:right w:val="single" w:sz="4" w:space="0" w:color="251C53"/>
+            </w:tcBorders>
+          </w:tcPr>
+          <w:p>
+            <w:r>
+              <w:rPr>
+                <w:b/>
+                <w:color w:val="FFFFFF"/>
+                <w:sz w:val="20"/>
+              </w:rPr>
+              <w:t>Ket qua</w:t>
+            </w:r>
+          </w:p>
+        </w:tc>
+      </w:tr>
+      <w:tr>
+        <w:tc>
+          <w:tcPr>
+            <w:tcW w:type="dxa" w:w="2422"/>
+            <w:tcBorders>
+              <w:top w:val="single" w:sz="4" w:space="0" w:color="CBCBCB"/>
+              <w:left w:val="single" w:sz="4" w:space="0" w:color="CBCBCB"/>
+              <w:bottom w:val="single" w:sz="4" w:space="0" w:color="CBCBCB"/>
+              <w:right w:val="single" w:sz="4" w:space="0" w:color="CBCBCB"/>
+            </w:tcBorders>
+          </w:tcPr>
+          <w:p>
+            <w:r>
+              <w:rPr>
+                <w:sz w:val="20"/>
+              </w:rPr>
+              <w:t>------</w:t>
+            </w:r>
+          </w:p>
+        </w:tc>
+        <w:tc>
+          <w:tcPr>
+            <w:tcW w:type="dxa" w:w="2422"/>
+            <w:tcBorders>
+              <w:top w:val="single" w:sz="4" w:space="0" w:color="CBCBCB"/>
+              <w:left w:val="single" w:sz="4" w:space="0" w:color="CBCBCB"/>
+              <w:bottom w:val="single" w:sz="4" w:space="0" w:color="CBCBCB"/>
+              <w:right w:val="single" w:sz="4" w:space="0" w:color="CBCBCB"/>
+            </w:tcBorders>
+          </w:tcPr>
+          <w:p>
+            <w:r>
+              <w:rPr>
+                <w:sz w:val="20"/>
+              </w:rPr>
+              <w:t>-----------</w:t>
+            </w:r>
+          </w:p>
+        </w:tc>
+        <w:tc>
+          <w:tcPr>
+            <w:tcW w:type="dxa" w:w="2422"/>
+            <w:tcBorders>
+              <w:top w:val="single" w:sz="4" w:space="0" w:color="CBCBCB"/>
+              <w:left w:val="single" w:sz="4" w:space="0" w:color="CBCBCB"/>
+              <w:bottom w:val="single" w:sz="4" w:space="0" w:color="CBCBCB"/>
+              <w:right w:val="single" w:sz="4" w:space="0" w:color="CBCBCB"/>
+            </w:tcBorders>
+          </w:tcPr>
+          <w:p>
+            <w:r>
+              <w:rPr>
+                <w:sz w:val="20"/>
+              </w:rPr>
+              <w:t>----------</w:t>
+            </w:r>
+          </w:p>
+        </w:tc>
+        <w:tc>
+          <w:tcPr>
+            <w:tcW w:type="dxa" w:w="2422"/>
+            <w:tcBorders>
+              <w:top w:val="single" w:sz="4" w:space="0" w:color="CBCBCB"/>
+              <w:left w:val="single" w:sz="4" w:space="0" w:color="CBCBCB"/>
+              <w:bottom w:val="single" w:sz="4" w:space="0" w:color="CBCBCB"/>
+              <w:right w:val="single" w:sz="4" w:space="0" w:color="CBCBCB"/>
+            </w:tcBorders>
+          </w:tcPr>
+          <w:p>
+            <w:r>
+              <w:rPr>
+                <w:sz w:val="20"/>
+              </w:rPr>
+              <w:t>---------</w:t>
+            </w:r>
+          </w:p>
+        </w:tc>
+      </w:tr>
+      <w:tr>
+        <w:tc>
+          <w:tcPr>
+            <w:tcW w:type="dxa" w:w="2422"/>
+            <w:shd w:val="clear" w:color="auto" w:fill="B8B3D6"/>
+            <w:tcBorders>
+              <w:top w:val="single" w:sz="4" w:space="0" w:color="CBCBCB"/>
+              <w:left w:val="single" w:sz="4" w:space="0" w:color="CBCBCB"/>
+              <w:bottom w:val="single" w:sz="4" w:space="0" w:color="CBCBCB"/>
+              <w:right w:val="single" w:sz="4" w:space="0" w:color="CBCBCB"/>
+            </w:tcBorders>
+          </w:tcPr>
+          <w:p>
+            <w:r>
+              <w:rPr>
+                <w:sz w:val="20"/>
+              </w:rPr>
+              <w:t>TC-001</w:t>
+            </w:r>
+          </w:p>
+        </w:tc>
+        <w:tc>
+          <w:tcPr>
+            <w:tcW w:type="dxa" w:w="2422"/>
+            <w:shd w:val="clear" w:color="auto" w:fill="B8B3D6"/>
+            <w:tcBorders>
+              <w:top w:val="single" w:sz="4" w:space="0" w:color="CBCBCB"/>
+              <w:left w:val="single" w:sz="4" w:space="0" w:color="CBCBCB"/>
+              <w:bottom w:val="single" w:sz="4" w:space="0" w:color="CBCBCB"/>
+              <w:right w:val="single" w:sz="4" w:space="0" w:color="CBCBCB"/>
+            </w:tcBorders>
+          </w:tcPr>
+          <w:p>
+            <w:r>
+              <w:rPr>
+                <w:sz w:val="20"/>
+              </w:rPr>
+              <w:t>POST /api/launch-app voi serial thiet bi that, app da cai</w:t>
+            </w:r>
+          </w:p>
+        </w:tc>
+        <w:tc>
+          <w:tcPr>
+            <w:tcW w:type="dxa" w:w="2422"/>
+            <w:shd w:val="clear" w:color="auto" w:fill="B8B3D6"/>
+            <w:tcBorders>
+              <w:top w:val="single" w:sz="4" w:space="0" w:color="CBCBCB"/>
+              <w:left w:val="single" w:sz="4" w:space="0" w:color="CBCBCB"/>
+              <w:bottom w:val="single" w:sz="4" w:space="0" w:color="CBCBCB"/>
+              <w:right w:val="single" w:sz="4" w:space="0" w:color="CBCBCB"/>
+            </w:tcBorders>
+          </w:tcPr>
+          <w:p>
+            <w:r>
+              <w:rPr>
+                <w:sz w:val="20"/>
+              </w:rPr>
+              <w:t>200 + app mo tren thiet bi</w:t>
+            </w:r>
+          </w:p>
+        </w:tc>
+        <w:tc>
+          <w:tcPr>
+            <w:tcW w:type="dxa" w:w="2422"/>
+            <w:shd w:val="clear" w:color="auto" w:fill="B8B3D6"/>
+            <w:tcBorders>
+              <w:top w:val="single" w:sz="4" w:space="0" w:color="CBCBCB"/>
+              <w:left w:val="single" w:sz="4" w:space="0" w:color="CBCBCB"/>
+              <w:bottom w:val="single" w:sz="4" w:space="0" w:color="CBCBCB"/>
+              <w:right w:val="single" w:sz="4" w:space="0" w:color="CBCBCB"/>
+            </w:tcBorders>
+          </w:tcPr>
+          <w:p>
+            <w:r>
+              <w:rPr>
+                <w:sz w:val="20"/>
+              </w:rPr>
+              <w:t>[ ] PASS / [ ] FAIL</w:t>
+            </w:r>
+          </w:p>
+        </w:tc>
+      </w:tr>
+      <w:tr>
+        <w:tc>
+          <w:tcPr>
+            <w:tcW w:type="dxa" w:w="2422"/>
+            <w:tcBorders>
+              <w:top w:val="single" w:sz="4" w:space="0" w:color="CBCBCB"/>
+              <w:left w:val="single" w:sz="4" w:space="0" w:color="CBCBCB"/>
+              <w:bottom w:val="single" w:sz="4" w:space="0" w:color="CBCBCB"/>
+              <w:right w:val="single" w:sz="4" w:space="0" w:color="CBCBCB"/>
+            </w:tcBorders>
+          </w:tcPr>
+          <w:p>
+            <w:r>
+              <w:rPr>
+                <w:sz w:val="20"/>
+              </w:rPr>
+              <w:t>TC-006</w:t>
+            </w:r>
+          </w:p>
+        </w:tc>
+        <w:tc>
+          <w:tcPr>
+            <w:tcW w:type="dxa" w:w="2422"/>
+            <w:tcBorders>
+              <w:top w:val="single" w:sz="4" w:space="0" w:color="CBCBCB"/>
+              <w:left w:val="single" w:sz="4" w:space="0" w:color="CBCBCB"/>
+              <w:bottom w:val="single" w:sz="4" w:space="0" w:color="CBCBCB"/>
+              <w:right w:val="single" w:sz="4" w:space="0" w:color="CBCBCB"/>
+            </w:tcBorders>
+          </w:tcPr>
+          <w:p>
+            <w:r>
+              <w:rPr>
+                <w:sz w:val="20"/>
+              </w:rPr>
+              <w:t>Ngat ket noi ADB thiet bi → curl lai</w:t>
+            </w:r>
+          </w:p>
+        </w:tc>
+        <w:tc>
+          <w:tcPr>
+            <w:tcW w:type="dxa" w:w="2422"/>
+            <w:tcBorders>
+              <w:top w:val="single" w:sz="4" w:space="0" w:color="CBCBCB"/>
+              <w:left w:val="single" w:sz="4" w:space="0" w:color="CBCBCB"/>
+              <w:bottom w:val="single" w:sz="4" w:space="0" w:color="CBCBCB"/>
+              <w:right w:val="single" w:sz="4" w:space="0" w:color="CBCBCB"/>
+            </w:tcBorders>
+          </w:tcPr>
+          <w:p>
+            <w:r>
+              <w:rPr>
+                <w:sz w:val="20"/>
+              </w:rPr>
+              <w:t>422 "device offline"</w:t>
+            </w:r>
+          </w:p>
+        </w:tc>
+        <w:tc>
+          <w:tcPr>
+            <w:tcW w:type="dxa" w:w="2422"/>
+            <w:tcBorders>
+              <w:top w:val="single" w:sz="4" w:space="0" w:color="CBCBCB"/>
+              <w:left w:val="single" w:sz="4" w:space="0" w:color="CBCBCB"/>
+              <w:bottom w:val="single" w:sz="4" w:space="0" w:color="CBCBCB"/>
+              <w:right w:val="single" w:sz="4" w:space="0" w:color="CBCBCB"/>
+            </w:tcBorders>
+          </w:tcPr>
+          <w:p>
+            <w:r>
+              <w:rPr>
+                <w:sz w:val="20"/>
+              </w:rPr>
+              <w:t>[ ] PASS / [ ] FAIL</w:t>
+            </w:r>
+          </w:p>
+        </w:tc>
+      </w:tr>
+      <w:tr>
+        <w:tc>
+          <w:tcPr>
+            <w:tcW w:type="dxa" w:w="2422"/>
+            <w:shd w:val="clear" w:color="auto" w:fill="B8B3D6"/>
+            <w:tcBorders>
+              <w:top w:val="single" w:sz="4" w:space="0" w:color="CBCBCB"/>
+              <w:left w:val="single" w:sz="4" w:space="0" w:color="CBCBCB"/>
+              <w:bottom w:val="single" w:sz="4" w:space="0" w:color="CBCBCB"/>
+              <w:right w:val="single" w:sz="4" w:space="0" w:color="CBCBCB"/>
+            </w:tcBorders>
+          </w:tcPr>
+          <w:p>
+            <w:r>
+              <w:rPr>
+                <w:sz w:val="20"/>
+              </w:rPr>
+              <w:t>TC-007</w:t>
+            </w:r>
+          </w:p>
+        </w:tc>
+        <w:tc>
+          <w:tcPr>
+            <w:tcW w:type="dxa" w:w="2422"/>
+            <w:shd w:val="clear" w:color="auto" w:fill="B8B3D6"/>
+            <w:tcBorders>
+              <w:top w:val="single" w:sz="4" w:space="0" w:color="CBCBCB"/>
+              <w:left w:val="single" w:sz="4" w:space="0" w:color="CBCBCB"/>
+              <w:bottom w:val="single" w:sz="4" w:space="0" w:color="CBCBCB"/>
+              <w:right w:val="single" w:sz="4" w:space="0" w:color="CBCBCB"/>
+            </w:tcBorders>
+          </w:tcPr>
+          <w:p>
+            <w:r>
+              <w:rPr>
+                <w:sz w:val="20"/>
+              </w:rPr>
+              <w:t>POST voi package name chua cai</w:t>
+            </w:r>
+          </w:p>
+        </w:tc>
+        <w:tc>
+          <w:tcPr>
+            <w:tcW w:type="dxa" w:w="2422"/>
+            <w:shd w:val="clear" w:color="auto" w:fill="B8B3D6"/>
+            <w:tcBorders>
+              <w:top w:val="single" w:sz="4" w:space="0" w:color="CBCBCB"/>
+              <w:left w:val="single" w:sz="4" w:space="0" w:color="CBCBCB"/>
+              <w:bottom w:val="single" w:sz="4" w:space="0" w:color="CBCBCB"/>
+              <w:right w:val="single" w:sz="4" w:space="0" w:color="CBCBCB"/>
+            </w:tcBorders>
+          </w:tcPr>
+          <w:p>
+            <w:r>
+              <w:rPr>
+                <w:sz w:val="20"/>
+              </w:rPr>
+              <w:t>422 "package not installed"</w:t>
+            </w:r>
+          </w:p>
+        </w:tc>
+        <w:tc>
+          <w:tcPr>
+            <w:tcW w:type="dxa" w:w="2422"/>
+            <w:shd w:val="clear" w:color="auto" w:fill="B8B3D6"/>
+            <w:tcBorders>
+              <w:top w:val="single" w:sz="4" w:space="0" w:color="CBCBCB"/>
+              <w:left w:val="single" w:sz="4" w:space="0" w:color="CBCBCB"/>
+              <w:bottom w:val="single" w:sz="4" w:space="0" w:color="CBCBCB"/>
+              <w:right w:val="single" w:sz="4" w:space="0" w:color="CBCBCB"/>
+            </w:tcBorders>
+          </w:tcPr>
+          <w:p>
+            <w:r>
+              <w:rPr>
+                <w:sz w:val="20"/>
+              </w:rPr>
+              <w:t>[ ] PASS / [ ] FAIL</w:t>
+            </w:r>
+          </w:p>
+        </w:tc>
+      </w:tr>
+    </w:tbl>
+    <w:p/>
+    <w:p>
+      <w:pPr>
+        <w:spacing w:after="80"/>
+      </w:pPr>
+      <w:r>
+        <w:rPr>
+          <w:b/>
+          <w:sz w:val="21"/>
+        </w:rPr>
+        <w:t>Buoc 4 — Quyet dinh go-live</w:t>
+      </w:r>
+    </w:p>
+    <w:p>
+      <w:pPr>
+        <w:pStyle w:val="ListBullet"/>
+        <w:spacing w:after="20"/>
+        <w:ind w:left="283"/>
+      </w:pPr>
+      <w:r>
+        <w:rPr>
+          <w:sz w:val="21"/>
+        </w:rPr>
+        <w:t>Ca 3 case PASS → chinh thuc deploy production, thong bao team (#deploys), standby monitor.</w:t>
+      </w:r>
+    </w:p>
+    <w:p>
+      <w:pPr>
+        <w:pStyle w:val="ListBullet"/>
+        <w:spacing w:after="20"/>
+        <w:ind w:left="283"/>
+      </w:pPr>
+      <w:r>
+        <w:rPr>
+          <w:sz w:val="21"/>
+        </w:rPr>
+        <w:t>Co case FAIL → BAO NGAY cho Tech Lead truoc khi deploy production. KHONG deploy khi biet co bug.</w:t>
+      </w:r>
+    </w:p>
+    <w:p>
+      <w:pPr>
+        <w:pBdr>
+          <w:bottom w:val="single" w:sz="6" w:space="1" w:color="F05922"/>
+        </w:pBdr>
+        <w:spacing w:after="120"/>
+      </w:pPr>
+    </w:p>
+    <w:p>
+      <w:pPr>
+        <w:pStyle w:val="Heading2"/>
+        <w:spacing w:before="200" w:after="80"/>
+      </w:pPr>
+      <w:r>
+        <w:rPr>
+          <w:color w:val="F05922"/>
+          <w:sz w:val="28"/>
+        </w:rPr>
+        <w:t>9. Lich su deploy</w:t>
       </w:r>
     </w:p>
     <w:tbl>
@@ -2706,6 +4351,103 @@
                 <w:sz w:val="20"/>
               </w:rPr>
               <w:t>Chua co thiet bi Android that</w:t>
+            </w:r>
+          </w:p>
+        </w:tc>
+      </w:tr>
+      <w:tr>
+        <w:tc>
+          <w:tcPr>
+            <w:tcW w:type="dxa" w:w="1938"/>
+            <w:tcBorders>
+              <w:top w:val="single" w:sz="4" w:space="0" w:color="CBCBCB"/>
+              <w:left w:val="single" w:sz="4" w:space="0" w:color="CBCBCB"/>
+              <w:bottom w:val="single" w:sz="4" w:space="0" w:color="CBCBCB"/>
+              <w:right w:val="single" w:sz="4" w:space="0" w:color="CBCBCB"/>
+            </w:tcBorders>
+          </w:tcPr>
+          <w:p>
+            <w:r>
+              <w:rPr>
+                <w:sz w:val="20"/>
+              </w:rPr>
+              <w:t>2026-08-18</w:t>
+            </w:r>
+          </w:p>
+        </w:tc>
+        <w:tc>
+          <w:tcPr>
+            <w:tcW w:type="dxa" w:w="1938"/>
+            <w:tcBorders>
+              <w:top w:val="single" w:sz="4" w:space="0" w:color="CBCBCB"/>
+              <w:left w:val="single" w:sz="4" w:space="0" w:color="CBCBCB"/>
+              <w:bottom w:val="single" w:sz="4" w:space="0" w:color="CBCBCB"/>
+              <w:right w:val="single" w:sz="4" w:space="0" w:color="CBCBCB"/>
+            </w:tcBorders>
+          </w:tcPr>
+          <w:p>
+            <w:r>
+              <w:rPr>
+                <w:sz w:val="20"/>
+              </w:rPr>
+              <w:t>Staging review</w:t>
+            </w:r>
+          </w:p>
+        </w:tc>
+        <w:tc>
+          <w:tcPr>
+            <w:tcW w:type="dxa" w:w="1938"/>
+            <w:tcBorders>
+              <w:top w:val="single" w:sz="4" w:space="0" w:color="CBCBCB"/>
+              <w:left w:val="single" w:sz="4" w:space="0" w:color="CBCBCB"/>
+              <w:bottom w:val="single" w:sz="4" w:space="0" w:color="CBCBCB"/>
+              <w:right w:val="single" w:sz="4" w:space="0" w:color="CBCBCB"/>
+            </w:tcBorders>
+          </w:tcPr>
+          <w:p>
+            <w:r>
+              <w:rPr>
+                <w:sz w:val="20"/>
+              </w:rPr>
+              <w:t>DevOps Lead</w:t>
+            </w:r>
+          </w:p>
+        </w:tc>
+        <w:tc>
+          <w:tcPr>
+            <w:tcW w:type="dxa" w:w="1938"/>
+            <w:tcBorders>
+              <w:top w:val="single" w:sz="4" w:space="0" w:color="CBCBCB"/>
+              <w:left w:val="single" w:sz="4" w:space="0" w:color="CBCBCB"/>
+              <w:bottom w:val="single" w:sz="4" w:space="0" w:color="CBCBCB"/>
+              <w:right w:val="single" w:sz="4" w:space="0" w:color="CBCBCB"/>
+            </w:tcBorders>
+          </w:tcPr>
+          <w:p>
+            <w:r>
+              <w:rPr>
+                <w:sz w:val="20"/>
+              </w:rPr>
+              <w:t>APPROVE STAGING</w:t>
+            </w:r>
+          </w:p>
+        </w:tc>
+        <w:tc>
+          <w:tcPr>
+            <w:tcW w:type="dxa" w:w="1938"/>
+            <w:tcBorders>
+              <w:top w:val="single" w:sz="4" w:space="0" w:color="CBCBCB"/>
+              <w:left w:val="single" w:sz="4" w:space="0" w:color="CBCBCB"/>
+              <w:bottom w:val="single" w:sz="4" w:space="0" w:color="CBCBCB"/>
+              <w:right w:val="single" w:sz="4" w:space="0" w:color="CBCBCB"/>
+            </w:tcBorders>
+          </w:tcPr>
+          <w:p>
+            <w:r>
+              <w:rPr>
+                <w:sz w:val="20"/>
+              </w:rPr>
+              <w:t>Container evidence du; production cho user smoke test thiet bi that</w:t>
             </w:r>
           </w:p>
         </w:tc>

</xml_diff>